<commit_message>
Refine Cloud Computing Assignment 1 draft through Task 7
</commit_message>
<xml_diff>
--- a/School/CloudComputing/Assignment1_Final_Draft.docx
+++ b/School/CloudComputing/Assignment1_Final_Draft.docx
@@ -38,22 +38,27 @@
     </w:p>
     <w:p>
       <w:r>
-        <w:t>CloudCo should use a Type 1 hypervisor for the production cluster and a Type 2 hypervisor for the dev/test lab.</w:t>
+        <w:t>CloudCo should use a Type 1 hypervisor in the production cluster and a Type 2 hypervisor in the dev/test lab.</w:t>
       </w:r>
     </w:p>
     <w:p>
       <w:r>
-        <w:t>For the production cluster, Type 1 is the better choice because these customer-facing services operate under strict SLAs and therefore require high performance, strong isolation, and reliable resource control. A Type 1 hypervisor runs directly on hardware and is designed specifically for virtualization. This usually gives better efficiency because there is no extra host operating system layer. It also provides stronger safety, since the hypervisor has full control over CPU, memory, and I/O resources. For example, if CloudCo hosts web and e-commerce services in separate VMs, Type 1 helps ensure that a failure or compromise in one VM is less likely to affect others. In addition, Type 1 hypervisors support datacentre features such as snapshots, cloning, and live migration, which improves manageability in production.</w:t>
+        <w:t>For the production cluster, Type 1 is the correct choice because CloudCo is hosting customer-facing workloads under strict SLAs. According to the lecture, a good hypervisor should provide safety, fidelity, and efficiency. Type 1 hypervisors run directly on hardware and are specifically designed for virtualization, so they generally provide better performance and stronger resource control than Type 2. This matters in production because customer services such as web, email, and e-commerce workloads need predictable throughput and low latency.</w:t>
       </w:r>
     </w:p>
     <w:p>
       <w:r>
-        <w:t>For the dev/test lab, Type 2 is more suitable because engineers frequently create, test, and remove VMs. A Type 2 hypervisor runs on top of a standard operating system, so it is easier to install and use on developer machines. Although it has lower overall performance and weaker isolation than Type 1, it is more convenient for temporary testing environments. For example, an engineer can quickly run different guest operating systems on a laptop using VMware Workstation or VirtualBox.</w:t>
+        <w:t>Type 1 is also stronger from a security perspective. Because the hypervisor has direct control over CPU, memory, and I/O, isolation between VMs is stronger and the attack surface is smaller than in a design that depends on a full host operating system. For example, if CloudCo runs separate customer-facing VMs for web and e-commerce services, a compromise or crash in one VM is less likely to affect the others. In addition, Type 1 hypervisors are easier to manage at datacentre scale because they support features such as snapshots, cloning, and live migration.</w:t>
       </w:r>
     </w:p>
     <w:p>
       <w:r>
-        <w:t>In summary, Type 1 should be used for production because it offers better performance, security, and enterprise manageability, while Type 2 is better for dev/test because it is simpler and more flexible for frequent experimentation.</w:t>
+        <w:t>For the dev/test lab, Type 2 is more suitable because engineers frequently create, modify, and delete VMs. A Type 2 hypervisor runs on top of a standard operating system, which makes it easier to install on desktops or laptops and more convenient for experimentation. Although it has lower overall performance and weaker isolation than Type 1, these drawbacks are acceptable in a temporary testing environment. For example, an engineer can quickly spin up different guest operating systems using VMware Workstation or VirtualBox without requiring dedicated server hardware.</w:t>
+      </w:r>
+    </w:p>
+    <w:p>
+      <w:r>
+        <w:t>Therefore, Type 1 is the better choice for CloudCo’s production environment because it offers stronger performance, security, and enterprise manageability, while Type 2 is better for the dev/test lab because it prioritises flexibility and ease of use.</w:t>
       </w:r>
     </w:p>
     <w:p>
@@ -72,17 +77,17 @@
     </w:p>
     <w:p>
       <w:r>
-        <w:t>It is unsafe for a guest OS to run in real kernel mode because kernel mode gives direct access to privileged instructions, hardware devices, memory management, and I/O operations. If a guest OS were allowed to run with true kernel privileges, a buggy or malicious VM could modify hardware state, overwrite memory belonging to other VMs, or crash the entire host. For example, a compromised guest could attempt direct disk-controller access or alter page tables in a way that corrupts the memory isolation between tenants.</w:t>
+        <w:t>It is unsafe for a guest OS to run in real kernel mode because kernel mode gives full access to privileged instructions, hardware devices, memory management, and I/O operations. If a guest OS were allowed to run with true kernel privileges, a buggy or malicious VM could interfere with the entire host. For example, a compromised guest could attempt direct access to a disk controller, modify interrupt settings, or change memory mappings in a way that corrupts isolation between VMs. A failure in real kernel mode is therefore not limited to one process; it can become system-wide and catastrophic.</w:t>
       </w:r>
     </w:p>
     <w:p>
       <w:r>
-        <w:t>Trap-and-emulate solves this by keeping the hypervisor in real kernel mode while the guest OS runs in a virtual kernel mode, which is actually user mode from the hardware’s perspective. When the guest OS executes a privileged instruction, the CPU raises a trap to the hypervisor. The hypervisor then checks the request, performs a safe equivalent operation on behalf of the guest, and returns control to the VM. In this way, the guest behaves as if it controls the machine, but the hypervisor still maintains safety and fidelity.</w:t>
+        <w:t>Trap-and-emulate solves this problem by keeping the hypervisor in real kernel mode while the guest OS runs in a virtual kernel mode that is actually user mode from the hardware’s point of view. When the guest OS executes a privileged instruction, the CPU raises a trap to the hypervisor. The hypervisor gains control, examines the attempted operation, safely performs an equivalent action, and then returns control to the guest. In this way, the guest behaves as if it has kernel privileges, but the hypervisor still maintains safety and full resource control.</w:t>
       </w:r>
     </w:p>
     <w:p>
       <w:r>
-        <w:t>The cost is performance overhead. Every trapped privileged instruction causes extra work: a mode switch, hypervisor intervention, instruction decoding, and emulation. This increases CPU overhead and latency. For network-intensive workloads, where VMs perform frequent I/O operations, the number of traps can become very large. For example, a heavily loaded customer-facing web service may generate many network interrupts and device-access requests, so repeated trapping can increase packet-processing latency and reduce throughput.</w:t>
+        <w:t>This approach introduces performance overhead because every trapped privileged instruction causes extra work: a mode switch, hypervisor intervention, checking, and emulation. These additional steps consume CPU time and increase latency. The cost becomes more visible for network-intensive workloads because they perform frequent device-related operations and interrupts. For example, a heavily loaded VM serving customer web traffic may repeatedly trap on virtual network-device access, which adds delay to packet processing and can reduce overall throughput.</w:t>
       </w:r>
     </w:p>
     <w:p>
@@ -101,17 +106,17 @@
     </w:p>
     <w:p>
       <w:r>
-        <w:t>In a virtualized system, memory translation is more complex than in a normal OS because there are three address spaces: guest virtual address, guest physical address, and host physical address. Inside the VM, the guest OS still maintains its own page tables to translate guest virtual addresses to guest physical addresses. However, guest physical memory is not real hardware memory. The hypervisor must also maintain mappings from guest physical addresses to host physical addresses, while ensuring that VMs do not conflict with one another.</w:t>
+        <w:t>In a virtualized system, memory address translation is more complex than in a normal operating system because there are three address spaces: guest virtual address, guest physical address, and host physical address. Inside the VM, the guest OS still maintains its own page tables and translates guest virtual addresses to guest physical addresses, just as a normal OS would translate virtual addresses to physical addresses. However, guest physical memory is not real machine memory. The hypervisor must also maintain mappings from guest physical addresses to host physical addresses, while ensuring that multiple VMs do not conflict with one another.</w:t>
       </w:r>
     </w:p>
     <w:p>
       <w:r>
-        <w:t>Without hardware assistance, this two-level translation creates significant overhead because every memory access may require additional page table work. Nested Page Tables (NPTs) reduce this cost by moving much of the second-level translation into hardware. The CPU can walk both the guest page tables and the hypervisor-managed nested mappings more efficiently, so the hypervisor no longer needs to intervene as often for routine address translation. This reduces CPU overhead and improves performance under heavy VM activity.</w:t>
+        <w:t>This creates a two-level translation problem. Without hardware support, the hypervisor must work hard to maintain the mappings and keep them consistent whenever the guest modifies its page tables. Hardware support through Nested Page Tables (NPTs) changes this by allowing the CPU to accelerate the second level of translation. Each guest still maintains its own page tables, but the hypervisor maintains per-VM NPTs that map guest physical addresses to host physical addresses. The CPU can then walk both sets of mappings more efficiently, reducing the need for frequent hypervisor intervention and lowering the cost of memory virtualization.</w:t>
       </w:r>
     </w:p>
     <w:p>
       <w:r>
-        <w:t>However, some residual overheads still remain. TLB misses become more expensive because the CPU may need to walk both levels of translation again. Page faults and frequent updates to mappings can also still be costly. For example, if CloudCo runs a memory-intensive analytics VM that constantly allocates and modifies large memory regions, the host may still experience high CPU usage due to repeated translation work and memory-management events, even when NPT support is enabled. Therefore, hardware support reduces but does not completely eliminate memory virtualization overhead.</w:t>
+        <w:t>However, residual overhead still remains. TLB misses become more expensive because the CPU may need to walk both the guest page table and the nested page table again. Page faults and frequent mapping changes also still create overhead. For example, if CloudCo runs a memory-intensive analytics VM that constantly allocates and updates large in-memory datasets, CPU usage can remain high because address translation and memory-management events still occur very frequently, even with NPT support. Therefore, NPTs significantly reduce the cost of memory virtualization, but they do not remove it completely.</w:t>
       </w:r>
     </w:p>
     <w:p>
@@ -130,17 +135,17 @@
     </w:p>
     <w:p>
       <w:r>
-        <w:t>Paravirtualization changes the relationship between the guest OS and the hypervisor by making the guest OS aware that it is running inside a virtual machine. Instead of behaving as if it owns the hardware, the modified guest OS issues hypercalls directly to the hypervisor whenever privileged operations are needed. In full virtualization, by contrast, the guest behaves like a normal OS and privileged instructions are intercepted through trap-and-emulate.</w:t>
+        <w:t>Paravirtualization changes the interaction between the guest OS and the hypervisor by making the guest OS aware that it is running inside a virtual machine. In full virtualization, the guest behaves as if it owns the hardware, so privileged instructions must be intercepted through trap-and-emulate. In paravirtualization, the guest OS is modified to cooperate with the hypervisor and uses hypercalls instead of attempting privileged operations directly.</w:t>
       </w:r>
     </w:p>
     <w:p>
       <w:r>
-        <w:t>This can be faster than trap-and-emulate because the hypervisor does not need to wait for a trap, decode the fault, and emulate the operation. The request path is more direct. This is especially useful for I/O-heavy workloads, where many privileged device operations occur. For example, a Linux VM running a high-volume storage or network service may achieve lower overhead when using paravirtualized drivers because repeated device-access traps are avoided.</w:t>
+        <w:t>This can be faster than trap-and-emulate because the hypervisor does not need to wait for a fault, analyse it, and emulate the operation. The guest asks the hypervisor directly for privileged services, so the path is shorter and the overhead is lower. This is particularly useful for I/O-heavy workloads, where many device-related operations would otherwise trigger repeated traps. For example, a Linux VM running a high-volume storage or networking workload can benefit from paravirtualized drivers because the number of costly device-access traps is reduced.</w:t>
       </w:r>
     </w:p>
     <w:p>
       <w:r>
-        <w:t>However, the performance benefit of paravirtualization has become smaller as hardware virtualization support has improved. Features such as Intel VT-x, AMD-V, and hardware-assisted memory virtualization reduce the cost of full virtualization significantly. As a result, many production environments now prefer full virtualization for broader compatibility and easier guest support. Paravirtualization may still be preferred when workloads are highly I/O-intensive, the guest OS can be modified, and the environment is controlled. For example, CloudCo may still benefit from paravirtualized Linux guests in a specialised internal platform where maximum I/O efficiency matters more than portability.</w:t>
+        <w:t>Modern hardware virtualization features have reduced this advantage. CPU extensions such as Intel VT-x and AMD-V, together with hardware-assisted memory virtualization and improved virtual I/O support, make full virtualization much more efficient than before. As a result, the performance gap between full virtualization and paravirtualization is smaller in many modern systems. Even so, paravirtualization may still be preferred when the workload is highly I/O-intensive, the guest OS can be modified, and the environment is tightly controlled. For example, CloudCo may still prefer paravirtualized Linux guests for specialised internal services where maximum I/O performance matters more than portability or guest OS transparency.</w:t>
       </w:r>
     </w:p>
     <w:p>
@@ -159,17 +164,17 @@
     </w:p>
     <w:p>
       <w:r>
-        <w:t>A live migration typically follows these key steps: first, a connection is established between the source and target hosts. Second, a new VM instance is created on the target host. Third, read-only memory pages are copied. Fourth, read-write pages are copied while the original VM is still running. Fifth, pages that were modified after being copied are marked as dirty and transferred again. Sixth, once the remaining dirty set is small enough, the VM is briefly paused and resumed on the target. Finally, the old VM instance is terminated on the source host.</w:t>
+        <w:t>A live migration allows CloudCo to move a running virtual machine from one host to another with minimal service interruption. The key steps are: (1) establish a connection between the source and target hosts, (2) create a new VM instance on the target, (3) copy read-only memory pages, (4) copy read-write pages while the source VM is still running, (5) track and recopy dirty pages, (6) briefly pause the VM, transfer the final state, and start the VM on the target, and (7) terminate the old VM on the source host.</w:t>
       </w:r>
     </w:p>
     <w:p>
       <w:r>
-        <w:t>Dirty pages require special handling because the VM continues serving requests while memory is being copied. If a page is copied and then modified by the running VM, the old copy is no longer valid. The hypervisor must therefore track these pages and recopy them before the final switchover. Without this process, the target VM could resume with inconsistent memory contents.</w:t>
+        <w:t>Dirty pages are memory pages that were modified after they had already been copied to the target. They need special handling because the VM continues to serve requests during migration. If the target only receives the earlier version of those pages, the resumed VM may start with inconsistent memory state. The hypervisor therefore tracks which pages become dirty and recopies them before the final switchover.</w:t>
       </w:r>
     </w:p>
     <w:p>
       <w:r>
-        <w:t>Two practical risks can still extend downtime. First, the dirty-page rate may remain too high. For example, if CloudCo migrates a busy in-memory database VM that constantly updates memory, pages may keep changing faster than they can be copied, delaying convergence and increasing pause time. Second, compatibility or device-state issues can delay the final handover. For example, if the target host cannot reproduce the exact runtime state quickly enough, the switchover may take longer than expected and customer-facing services may experience noticeable disruption.</w:t>
+        <w:t>Two practical risks can still cause extended downtime. First, the dirty-page rate may be too high. For example, if CloudCo migrates an in-memory database VM that is constantly updating records, pages may be dirtied faster than they can be copied, delaying convergence and extending the final pause. Second, transferring the final runtime state may take longer than expected if the VM has a large active memory footprint or complex device state. For example, a busy e-commerce VM with frequent memory and device activity may require a longer stop-and-copy phase than planned, causing noticeable service disruption even though the migration is technically live.</w:t>
       </w:r>
     </w:p>
     <w:p>
@@ -188,22 +193,22 @@
     </w:p>
     <w:p>
       <w:r>
-        <w:t>For CloudCo’s analytics platform, both virtual appliances and containers are useful, but they are suitable for different deployment scenarios.</w:t>
+        <w:t>For CloudCo’s analytics platform, both virtual appliances and containers are useful, but they are suitable in different scenarios.</w:t>
       </w:r>
     </w:p>
     <w:p>
       <w:r>
-        <w:t>A virtual appliance packages the full software stack into a preconfigured VM image, including the operating system, libraries, frameworks, and application code. This is valuable when deployment is complex and customers often face dependency problems. In CloudCo’s case, the analytics platform includes a web interface, SQL database, and analytics engine with many libraries such as Python, TensorFlow, pandas, and scikit-learn. A virtual appliance would allow CloudCo to deliver a ready-to-run environment that avoids version conflicts and operating-system misconfiguration. For example, a customer could import a prepared VM image and run the whole platform with minimal setup.</w:t>
+        <w:t>A virtual appliance packages the complete software stack into a preconfigured VM image, including the operating system, libraries, frameworks, and application code. This approach is valuable when deployment is complex and customers frequently encounter dependency problems. In CloudCo’s case, the platform includes a web interface, SQL database, and analytics engine with many dependencies such as Python, TensorFlow, pandas, and scikit-learn. A virtual appliance would allow CloudCo to deliver a ready-to-run environment that avoids version conflicts, missing libraries, and operating-system misconfiguration. For example, a customer could import a prepared VM image and run the full analytics platform without manually configuring every dependency.</w:t>
       </w:r>
     </w:p>
     <w:p>
       <w:r>
-        <w:t>Containers are lighter and start faster because they share the host operating system kernel. They are more suitable when components can be separated and deployed independently, especially in environments that already use container orchestration. For example, CloudCo could package the web interface, API service, and analytics worker as separate containers for faster scaling and easier updates. However, containers are less suitable if customers need full isolation, custom kernels, or a complete preconfigured OS-level environment.</w:t>
+        <w:t>Containers are lighter and start faster because they share the host operating system kernel. They are more suitable when components can be split into smaller services and deployed independently. For example, CloudCo could package the web interface, analytics worker, and API services as separate containers, making it easier to scale them independently and update them quickly. However, containers are less suitable if the deployment must include a full operating system environment or if customers need a fully self-contained package with maximum compatibility.</w:t>
       </w:r>
     </w:p>
     <w:p>
       <w:r>
-        <w:t>Therefore, virtual appliances are most suitable when CloudCo wants to deliver the entire analytics platform as a stable, self-contained product for customers with diverse infrastructure. Containers are most suitable when CloudCo wants modular deployment, rapid scaling, and easier lifecycle management in modern cloud-native environments.</w:t>
+        <w:t>Therefore, virtual appliances are most suitable when CloudCo wants to deliver the entire analytics platform as a stable, self-contained product to customers with varied infrastructure. Containers are most suitable when CloudCo wants modular deployment, faster scaling, and easier lifecycle management in a cloud-native environment.</w:t>
       </w:r>
     </w:p>
     <w:p>
@@ -222,22 +227,22 @@
     </w:p>
     <w:p>
       <w:r>
-        <w:t>Virtual machines and containers differ significantly in isolation strength, operating system compatibility, overhead, scalability, and management complexity. These differences mean CloudCo should not use the same deployment model for all workloads.</w:t>
+        <w:t>Virtual machines and containers differ in isolation strength, operating-system compatibility, performance overhead, scalability, and management complexity. Because CloudCo operates both legacy Windows applications and modern Linux microservices, it should not use the same virtualization approach for both.</w:t>
       </w:r>
     </w:p>
     <w:p>
       <w:r>
-        <w:t>VMs provide stronger isolation because each VM has its own guest operating system and virtualized hardware environment. This makes them suitable for legacy Windows applications, especially when those systems are difficult to modify and may require strict separation from other workloads. VMs also provide operating-system compatibility across different OS families, which containers do not. For example, a Windows legacy application cannot simply be packaged into a standard Linux container if it depends on Windows-specific APIs or kernel behaviour.</w:t>
+        <w:t>VMs provide stronger isolation because each VM has its own guest operating system and virtualized hardware environment. This makes them suitable for CloudCo’s legacy Windows applications, which are difficult to modify and may require strong separation from other workloads. VMs also provide broader operating-system compatibility because different guest operating systems can run on the same physical host. For example, a legacy Windows business application can run inside a Windows VM even if the host infrastructure also supports Linux workloads.</w:t>
       </w:r>
     </w:p>
     <w:p>
       <w:r>
-        <w:t>Containers provide weaker isolation because they share the host kernel, but they have much lower overhead and much better scalability. They start faster, consume fewer resources, and are easier to replicate for elastic microservices. This makes them ideal for CloudCo’s modern Linux-based web APIs, which require rapid scaling and frequent updates. Using VMs for these microservices would increase startup time, resource consumption, and operational overhead unnecessarily.</w:t>
+        <w:t>Containers provide weaker isolation because they share the host kernel, but they have much lower overhead and scale much more easily. They start faster, consume fewer resources, and are better suited to rapid deployment and elasticity. This makes them ideal for CloudCo’s Linux-based microservices that implement web APIs and need frequent updates. Running these microservices in full VMs would increase startup time, reduce density, and add unnecessary management overhead.</w:t>
       </w:r>
     </w:p>
     <w:p>
       <w:r>
-        <w:t>An appropriate strategy is therefore to deploy the legacy Windows applications in VMs and the Linux microservices in containers. Strong isolation is required for the Windows workloads because they are harder to modify, may be less predictable, and need OS compatibility. By contrast, the Linux microservices benefit more from fast scaling than from maximum isolation. Choosing the wrong approach would create clear problems: putting the Windows applications into containers would create compatibility and stability issues, while placing fast-changing microservices entirely in VMs would reduce elasticity and increase infrastructure cost.</w:t>
+        <w:t>The appropriate strategy is therefore to deploy the legacy Windows applications in VMs and the Linux microservices in containers. Strong isolation is more important for the Windows workloads because they are harder to modify, more sensitive to compatibility constraints, and less suited to shared-kernel isolation. By contrast, the Linux microservices benefit more from fast scaling and lightweight deployment. Choosing the wrong approach would create clear disadvantages: placing the Windows applications in containers would create compatibility and stability problems, while placing rapidly changing microservices entirely in VMs would reduce scalability, increase cost, and slow down deployment.</w:t>
       </w:r>
     </w:p>
     <w:sectPr>

</xml_diff>

<commit_message>
Tighten word counts for Cloud Computing Assignment 1
</commit_message>
<xml_diff>
--- a/School/CloudComputing/Assignment1_Final_Draft.docx
+++ b/School/CloudComputing/Assignment1_Final_Draft.docx
@@ -38,27 +38,27 @@
     </w:p>
     <w:p>
       <w:r>
-        <w:t>CloudCo should use a Type 1 hypervisor in the production cluster and a Type 2 hypervisor in the dev/test lab.</w:t>
+        <w:t>CloudCo should use a Type 1 hypervisor for the production cluster and a Type 2 hypervisor for the dev/test lab.</w:t>
       </w:r>
     </w:p>
     <w:p>
       <w:r>
-        <w:t>For the production cluster, Type 1 is the correct choice because CloudCo is hosting customer-facing workloads under strict SLAs. According to the lecture, a good hypervisor should provide safety, fidelity, and efficiency. Type 1 hypervisors run directly on hardware and are specifically designed for virtualization, so they generally provide better performance and stronger resource control than Type 2. This matters in production because customer services such as web, email, and e-commerce workloads need predictable throughput and low latency.</w:t>
+        <w:t>For the production cluster, Type 1 is the better choice because these workloads are customer-facing and operate under strict SLAs. A Type 1 hypervisor runs directly on hardware and is designed for virtualization, so it usually delivers better efficiency and stronger resource control than Type 2. This is important for production services because stable performance and predictable response times are required.</w:t>
       </w:r>
     </w:p>
     <w:p>
       <w:r>
-        <w:t>Type 1 is also stronger from a security perspective. Because the hypervisor has direct control over CPU, memory, and I/O, isolation between VMs is stronger and the attack surface is smaller than in a design that depends on a full host operating system. For example, if CloudCo runs separate customer-facing VMs for web and e-commerce services, a compromise or crash in one VM is less likely to affect the others. In addition, Type 1 hypervisors are easier to manage at datacentre scale because they support features such as snapshots, cloning, and live migration.</w:t>
+        <w:t>Type 1 is also better for security and manageability. The hypervisor has direct control over CPU, memory, and I/O, which improves isolation between VMs. For example, if CloudCo runs web and e-commerce services in separate VMs, a fault or compromise in one VM is less likely to affect the others. Type 1 hypervisors also support features such as snapshots, cloning, and live migration, which are useful in a datacentre.</w:t>
       </w:r>
     </w:p>
     <w:p>
       <w:r>
-        <w:t>For the dev/test lab, Type 2 is more suitable because engineers frequently create, modify, and delete VMs. A Type 2 hypervisor runs on top of a standard operating system, which makes it easier to install on desktops or laptops and more convenient for experimentation. Although it has lower overall performance and weaker isolation than Type 1, these drawbacks are acceptable in a temporary testing environment. For example, an engineer can quickly spin up different guest operating systems using VMware Workstation or VirtualBox without requiring dedicated server hardware.</w:t>
+        <w:t>For the dev/test lab, Type 2 is more suitable because engineers frequently create and remove VMs. A Type 2 hypervisor runs on top of a standard operating system, making it easier to install and use on developer machines. Although it has lower performance, that trade-off is acceptable in a temporary test environment. For example, an engineer can quickly test different guest operating systems using VirtualBox or VMware Workstation.</w:t>
       </w:r>
     </w:p>
     <w:p>
       <w:r>
-        <w:t>Therefore, Type 1 is the better choice for CloudCo’s production environment because it offers stronger performance, security, and enterprise manageability, while Type 2 is better for the dev/test lab because it prioritises flexibility and ease of use.</w:t>
+        <w:t>Therefore, Type 1 should be used for production because it offers stronger performance, security, and enterprise manageability, while Type 2 is better for dev/test because it is simpler and more flexible for experimentation.</w:t>
       </w:r>
     </w:p>
     <w:p>
@@ -77,17 +77,17 @@
     </w:p>
     <w:p>
       <w:r>
-        <w:t>It is unsafe for a guest OS to run in real kernel mode because kernel mode gives full access to privileged instructions, hardware devices, memory management, and I/O operations. If a guest OS were allowed to run with true kernel privileges, a buggy or malicious VM could interfere with the entire host. For example, a compromised guest could attempt direct access to a disk controller, modify interrupt settings, or change memory mappings in a way that corrupts isolation between VMs. A failure in real kernel mode is therefore not limited to one process; it can become system-wide and catastrophic.</w:t>
+        <w:t>It is unsafe for a guest OS to run in real kernel mode because kernel mode allows direct access to privileged instructions, hardware devices, memory management, and I/O operations. If a guest OS had true kernel privileges, a buggy or malicious VM could interfere with the entire host. For example, it could attempt direct disk-controller access or alter memory mappings in a way that breaks isolation between VMs.</w:t>
       </w:r>
     </w:p>
     <w:p>
       <w:r>
-        <w:t>Trap-and-emulate solves this problem by keeping the hypervisor in real kernel mode while the guest OS runs in a virtual kernel mode that is actually user mode from the hardware’s point of view. When the guest OS executes a privileged instruction, the CPU raises a trap to the hypervisor. The hypervisor gains control, examines the attempted operation, safely performs an equivalent action, and then returns control to the guest. In this way, the guest behaves as if it has kernel privileges, but the hypervisor still maintains safety and full resource control.</w:t>
+        <w:t>Trap-and-emulate solves this by keeping the hypervisor in real kernel mode while the guest OS runs in a virtual kernel mode that is actually user mode from the hardware’s perspective. When the guest executes a privileged instruction, the CPU traps to the hypervisor. The hypervisor checks the request, safely performs an equivalent action, and returns control to the guest. This preserves safety while allowing the guest OS to behave as if it controls the machine.</w:t>
       </w:r>
     </w:p>
     <w:p>
       <w:r>
-        <w:t>This approach introduces performance overhead because every trapped privileged instruction causes extra work: a mode switch, hypervisor intervention, checking, and emulation. These additional steps consume CPU time and increase latency. The cost becomes more visible for network-intensive workloads because they perform frequent device-related operations and interrupts. For example, a heavily loaded VM serving customer web traffic may repeatedly trap on virtual network-device access, which adds delay to packet processing and can reduce overall throughput.</w:t>
+        <w:t>The cost is performance overhead. Every trap causes extra work: a mode switch, hypervisor intervention, checking, and emulation. This consumes CPU time and increases latency. The impact is higher for network-intensive workloads because they perform frequent device-related operations. For example, a busy customer-facing web VM may repeatedly trap on virtual network-device access, adding delay to packet processing and reducing throughput.</w:t>
       </w:r>
     </w:p>
     <w:p>
@@ -106,17 +106,17 @@
     </w:p>
     <w:p>
       <w:r>
-        <w:t>In a virtualized system, memory address translation is more complex than in a normal operating system because there are three address spaces: guest virtual address, guest physical address, and host physical address. Inside the VM, the guest OS still maintains its own page tables and translates guest virtual addresses to guest physical addresses, just as a normal OS would translate virtual addresses to physical addresses. However, guest physical memory is not real machine memory. The hypervisor must also maintain mappings from guest physical addresses to host physical addresses, while ensuring that multiple VMs do not conflict with one another.</w:t>
+        <w:t>In a virtualized system, memory translation is harder because there are three address spaces: guest virtual, guest physical, and host physical. Inside the VM, the guest OS still maintains its own page tables to translate guest virtual addresses to guest physical addresses. However, guest physical memory is not real machine memory. The hypervisor must also maintain mappings from guest physical addresses to host physical addresses while ensuring that different VMs do not conflict.</w:t>
       </w:r>
     </w:p>
     <w:p>
       <w:r>
-        <w:t>This creates a two-level translation problem. Without hardware support, the hypervisor must work hard to maintain the mappings and keep them consistent whenever the guest modifies its page tables. Hardware support through Nested Page Tables (NPTs) changes this by allowing the CPU to accelerate the second level of translation. Each guest still maintains its own page tables, but the hypervisor maintains per-VM NPTs that map guest physical addresses to host physical addresses. The CPU can then walk both sets of mappings more efficiently, reducing the need for frequent hypervisor intervention and lowering the cost of memory virtualization.</w:t>
+        <w:t>This creates a two-level translation problem. Without hardware support, the hypervisor must work hard to maintain and update mappings whenever the guest changes its page tables. Nested Page Tables (NPTs) reduce this cost by allowing the CPU to accelerate the second level of translation. Each guest still keeps its own page tables, but the hypervisor maintains per-VM NPTs that map guest physical addresses to host physical addresses. This reduces frequent hypervisor intervention and lowers CPU overhead.</w:t>
       </w:r>
     </w:p>
     <w:p>
       <w:r>
-        <w:t>However, residual overhead still remains. TLB misses become more expensive because the CPU may need to walk both the guest page table and the nested page table again. Page faults and frequent mapping changes also still create overhead. For example, if CloudCo runs a memory-intensive analytics VM that constantly allocates and updates large in-memory datasets, CPU usage can remain high because address translation and memory-management events still occur very frequently, even with NPT support. Therefore, NPTs significantly reduce the cost of memory virtualization, but they do not remove it completely.</w:t>
+        <w:t>However, some overhead still remains. TLB misses are still expensive because the CPU may need to walk both translation levels again. Page faults and frequent mapping changes can also still create extra work. For example, if CloudCo runs a memory-intensive analytics VM that constantly updates large in-memory datasets, CPU usage can remain high because translation and memory-management events still occur very frequently, even with NPT support.</w:t>
       </w:r>
     </w:p>
     <w:p>
@@ -135,17 +135,17 @@
     </w:p>
     <w:p>
       <w:r>
-        <w:t>Paravirtualization changes the interaction between the guest OS and the hypervisor by making the guest OS aware that it is running inside a virtual machine. In full virtualization, the guest behaves as if it owns the hardware, so privileged instructions must be intercepted through trap-and-emulate. In paravirtualization, the guest OS is modified to cooperate with the hypervisor and uses hypercalls instead of attempting privileged operations directly.</w:t>
+        <w:t>Paravirtualization changes the interaction between the guest OS and the hypervisor by making the guest OS aware that it is running inside a VM. In full virtualization, the guest behaves as if it owns the hardware, so privileged instructions must be handled through trap-and-emulate. In paravirtualization, the modified guest OS uses hypercalls to request privileged services directly from the hypervisor.</w:t>
       </w:r>
     </w:p>
     <w:p>
       <w:r>
-        <w:t>This can be faster than trap-and-emulate because the hypervisor does not need to wait for a fault, analyse it, and emulate the operation. The guest asks the hypervisor directly for privileged services, so the path is shorter and the overhead is lower. This is particularly useful for I/O-heavy workloads, where many device-related operations would otherwise trigger repeated traps. For example, a Linux VM running a high-volume storage or networking workload can benefit from paravirtualized drivers because the number of costly device-access traps is reduced.</w:t>
+        <w:t>This can be faster than trap-and-emulate because the hypervisor does not need to wait for a trap, analyse it, and emulate the operation. The communication path is more direct, so overhead is lower. This is particularly useful for I/O-heavy workloads, where many device-related operations occur. For example, a Linux VM running a high-volume storage or network service may perform better with paravirtualized drivers because repeated device-access traps are avoided.</w:t>
       </w:r>
     </w:p>
     <w:p>
       <w:r>
-        <w:t>Modern hardware virtualization features have reduced this advantage. CPU extensions such as Intel VT-x and AMD-V, together with hardware-assisted memory virtualization and improved virtual I/O support, make full virtualization much more efficient than before. As a result, the performance gap between full virtualization and paravirtualization is smaller in many modern systems. Even so, paravirtualization may still be preferred when the workload is highly I/O-intensive, the guest OS can be modified, and the environment is tightly controlled. For example, CloudCo may still prefer paravirtualized Linux guests for specialised internal services where maximum I/O performance matters more than portability or guest OS transparency.</w:t>
+        <w:t>Modern hardware virtualization features have reduced this advantage. CPU support such as Intel VT-x and AMD-V makes full virtualization much more efficient than before. As a result, paravirtualization is now less necessary in many environments. It may still be preferred when the workload is highly I/O-intensive, the guest OS can be modified, and the environment is tightly controlled.</w:t>
       </w:r>
     </w:p>
     <w:p>
@@ -164,17 +164,17 @@
     </w:p>
     <w:p>
       <w:r>
-        <w:t>A live migration allows CloudCo to move a running virtual machine from one host to another with minimal service interruption. The key steps are: (1) establish a connection between the source and target hosts, (2) create a new VM instance on the target, (3) copy read-only memory pages, (4) copy read-write pages while the source VM is still running, (5) track and recopy dirty pages, (6) briefly pause the VM, transfer the final state, and start the VM on the target, and (7) terminate the old VM on the source host.</w:t>
+        <w:t>A live migration allows CloudCo to move a running virtual machine from one host to another with minimal service interruption. The key steps are: establish a connection between the source and target, create a new VM on the target, copy read-only pages, copy read-write pages while the original VM is still running, track and recopy dirty pages, briefly pause the VM for final transfer, resume it on the target, and terminate the old VM on the source host.</w:t>
       </w:r>
     </w:p>
     <w:p>
       <w:r>
-        <w:t>Dirty pages are memory pages that were modified after they had already been copied to the target. They need special handling because the VM continues to serve requests during migration. If the target only receives the earlier version of those pages, the resumed VM may start with inconsistent memory state. The hypervisor therefore tracks which pages become dirty and recopies them before the final switchover.</w:t>
+        <w:t>Dirty pages are memory pages that were modified after they had already been copied to the target. They need special handling because the VM continues to serve requests during migration. If the target only receives an old copy of those pages, the resumed VM may start with inconsistent memory state. The hypervisor must therefore track which pages become dirty and recopy them before the final switchover.</w:t>
       </w:r>
     </w:p>
     <w:p>
       <w:r>
-        <w:t>Two practical risks can still cause extended downtime. First, the dirty-page rate may be too high. For example, if CloudCo migrates an in-memory database VM that is constantly updating records, pages may be dirtied faster than they can be copied, delaying convergence and extending the final pause. Second, transferring the final runtime state may take longer than expected if the VM has a large active memory footprint or complex device state. For example, a busy e-commerce VM with frequent memory and device activity may require a longer stop-and-copy phase than planned, causing noticeable service disruption even though the migration is technically live.</w:t>
+        <w:t>Two practical risks can still extend downtime. First, the dirty-page rate may remain too high. For example, an in-memory database VM may change pages faster than they can be copied. Second, the final runtime state may take longer than expected to transfer if the VM has a large active memory footprint or complex device state, increasing the stop-and-copy pause.</w:t>
       </w:r>
     </w:p>
     <w:p>
@@ -198,17 +198,12 @@
     </w:p>
     <w:p>
       <w:r>
-        <w:t>A virtual appliance packages the complete software stack into a preconfigured VM image, including the operating system, libraries, frameworks, and application code. This approach is valuable when deployment is complex and customers frequently encounter dependency problems. In CloudCo’s case, the platform includes a web interface, SQL database, and analytics engine with many dependencies such as Python, TensorFlow, pandas, and scikit-learn. A virtual appliance would allow CloudCo to deliver a ready-to-run environment that avoids version conflicts, missing libraries, and operating-system misconfiguration. For example, a customer could import a prepared VM image and run the full analytics platform without manually configuring every dependency.</w:t>
+        <w:t>A virtual appliance packages the complete software stack into a preconfigured VM image, including the operating system, libraries, frameworks, and application code. This is valuable when deployment is complex and customers often encounter dependency problems. In CloudCo’s case, the platform includes a web interface, SQL database, and analytics engine with many dependencies such as Python, TensorFlow, pandas, and scikit-learn. For example, a customer could import a prepared VM image and run the full platform without manually configuring each dependency.</w:t>
       </w:r>
     </w:p>
     <w:p>
       <w:r>
-        <w:t>Containers are lighter and start faster because they share the host operating system kernel. They are more suitable when components can be split into smaller services and deployed independently. For example, CloudCo could package the web interface, analytics worker, and API services as separate containers, making it easier to scale them independently and update them quickly. However, containers are less suitable if the deployment must include a full operating system environment or if customers need a fully self-contained package with maximum compatibility.</w:t>
-      </w:r>
-    </w:p>
-    <w:p>
-      <w:r>
-        <w:t>Therefore, virtual appliances are most suitable when CloudCo wants to deliver the entire analytics platform as a stable, self-contained product to customers with varied infrastructure. Containers are most suitable when CloudCo wants modular deployment, faster scaling, and easier lifecycle management in a cloud-native environment.</w:t>
+        <w:t>Containers are lighter and start faster because they share the host operating system kernel. They are more suitable when components can be split into smaller services and deployed independently. For example, CloudCo could package the web interface, analytics worker, and API services as separate containers for faster scaling and updates. Therefore, virtual appliances suit full, self-contained delivery, while containers suit modular, cloud-native deployment.</w:t>
       </w:r>
     </w:p>
     <w:p>
@@ -227,22 +222,22 @@
     </w:p>
     <w:p>
       <w:r>
-        <w:t>Virtual machines and containers differ in isolation strength, operating-system compatibility, performance overhead, scalability, and management complexity. Because CloudCo operates both legacy Windows applications and modern Linux microservices, it should not use the same virtualization approach for both.</w:t>
+        <w:t>Virtual machines and containers differ in isolation strength, operating-system compatibility, performance overhead, scalability, and management complexity. Because CloudCo operates both legacy Windows applications and modern Linux microservices, it should not use the same approach for both.</w:t>
       </w:r>
     </w:p>
     <w:p>
       <w:r>
-        <w:t>VMs provide stronger isolation because each VM has its own guest operating system and virtualized hardware environment. This makes them suitable for CloudCo’s legacy Windows applications, which are difficult to modify and may require strong separation from other workloads. VMs also provide broader operating-system compatibility because different guest operating systems can run on the same physical host. For example, a legacy Windows business application can run inside a Windows VM even if the host infrastructure also supports Linux workloads.</w:t>
+        <w:t>VMs provide stronger isolation because each VM has its own guest OS and virtualized hardware. This makes them suitable for CloudCo’s legacy Windows applications, which are difficult to modify and may require strict separation from other workloads. VMs also provide broader operating-system compatibility. For example, a legacy Windows application can run inside a Windows VM even if the surrounding infrastructure also supports Linux workloads.</w:t>
       </w:r>
     </w:p>
     <w:p>
       <w:r>
-        <w:t>Containers provide weaker isolation because they share the host kernel, but they have much lower overhead and scale much more easily. They start faster, consume fewer resources, and are better suited to rapid deployment and elasticity. This makes them ideal for CloudCo’s Linux-based microservices that implement web APIs and need frequent updates. Running these microservices in full VMs would increase startup time, reduce density, and add unnecessary management overhead.</w:t>
+        <w:t>Containers provide weaker isolation because they share the host kernel, but they have much lower overhead and scale much more easily. They start faster, consume fewer resources, and are ideal for Linux-based microservices that require rapid scaling and frequent updates. Running these microservices in full VMs would increase startup time and resource usage unnecessarily.</w:t>
       </w:r>
     </w:p>
     <w:p>
       <w:r>
-        <w:t>The appropriate strategy is therefore to deploy the legacy Windows applications in VMs and the Linux microservices in containers. Strong isolation is more important for the Windows workloads because they are harder to modify, more sensitive to compatibility constraints, and less suited to shared-kernel isolation. By contrast, the Linux microservices benefit more from fast scaling and lightweight deployment. Choosing the wrong approach would create clear disadvantages: placing the Windows applications in containers would create compatibility and stability problems, while placing rapidly changing microservices entirely in VMs would reduce scalability, increase cost, and slow down deployment.</w:t>
+        <w:t>The appropriate strategy is therefore to deploy the legacy Windows applications in VMs and the Linux microservices in containers. Strong isolation is more important for the Windows workloads because of compatibility and stability requirements. By contrast, the microservices benefit more from fast scaling. Choosing the wrong approach would create clear disadvantages, such as compatibility issues for Windows apps in containers or poor elasticity if lightweight microservices are forced into full VMs.</w:t>
       </w:r>
     </w:p>
     <w:sectPr>

</xml_diff>

<commit_message>
Reduce Task 1 word count in Cloud Computing Assignment 1
</commit_message>
<xml_diff>
--- a/School/CloudComputing/Assignment1_Final_Draft.docx
+++ b/School/CloudComputing/Assignment1_Final_Draft.docx
@@ -43,12 +43,12 @@
     </w:p>
     <w:p>
       <w:r>
-        <w:t>For the production cluster, Type 1 is the better choice because these workloads are customer-facing and operate under strict SLAs. A Type 1 hypervisor runs directly on hardware and is designed for virtualization, so it usually delivers better efficiency and stronger resource control than Type 2. This is important for production services because stable performance and predictable response times are required.</w:t>
+        <w:t>For the production cluster, Type 1 is the better choice because these workloads are customer-facing and operate under strict SLAs. A Type 1 hypervisor runs directly on hardware and is designed for virtualization, so it generally provides better efficiency and stronger resource control than Type 2. This is important because production services need stable performance and predictable response times.</w:t>
       </w:r>
     </w:p>
     <w:p>
       <w:r>
-        <w:t>Type 1 is also better for security and manageability. The hypervisor has direct control over CPU, memory, and I/O, which improves isolation between VMs. For example, if CloudCo runs web and e-commerce services in separate VMs, a fault or compromise in one VM is less likely to affect the others. Type 1 hypervisors also support features such as snapshots, cloning, and live migration, which are useful in a datacentre.</w:t>
+        <w:t>Type 1 is also better for security and manageability. The hypervisor has direct control over CPU, memory, and I/O, which improves isolation between VMs. For example, if CloudCo runs web and e-commerce services in separate VMs, a fault in one VM is less likely to affect the others. Type 1 hypervisors also support snapshots, cloning, and live migration, which are useful in a datacentre.</w:t>
       </w:r>
     </w:p>
     <w:p>
@@ -58,7 +58,7 @@
     </w:p>
     <w:p>
       <w:r>
-        <w:t>Therefore, Type 1 should be used for production because it offers stronger performance, security, and enterprise manageability, while Type 2 is better for dev/test because it is simpler and more flexible for experimentation.</w:t>
+        <w:t>Therefore, Type 1 should be used for production because it offers stronger performance, security, and manageability, while Type 2 is better for dev/test because it is simpler and more flexible for experimentation.</w:t>
       </w:r>
     </w:p>
     <w:p>
@@ -174,7 +174,7 @@
     </w:p>
     <w:p>
       <w:r>
-        <w:t>Two practical risks can still extend downtime. First, the dirty-page rate may remain too high. For example, an in-memory database VM may change pages faster than they can be copied. Second, the final runtime state may take longer than expected to transfer if the VM has a large active memory footprint or complex device state, increasing the stop-and-copy pause.</w:t>
+        <w:t>Two practical risks can still extend downtime. First, the dirty-page rate may be too high. For example, an in-memory database VM may change pages faster than they can be copied. Second, the final runtime state may take longer than expected to transfer if the VM has a large active memory footprint or complex device state, increasing the stop-and-copy pause.</w:t>
       </w:r>
     </w:p>
     <w:p>

</xml_diff>

<commit_message>
Further shorten Task 1 in Cloud Computing Assignment 1
</commit_message>
<xml_diff>
--- a/School/CloudComputing/Assignment1_Final_Draft.docx
+++ b/School/CloudComputing/Assignment1_Final_Draft.docx
@@ -43,12 +43,12 @@
     </w:p>
     <w:p>
       <w:r>
-        <w:t>For the production cluster, Type 1 is the better choice because these workloads are customer-facing and operate under strict SLAs. A Type 1 hypervisor runs directly on hardware and is designed for virtualization, so it generally provides better efficiency and stronger resource control than Type 2. This is important because production services need stable performance and predictable response times.</w:t>
+        <w:t>For the production cluster, Type 1 is the better choice because these workloads are customer-facing and operate under strict SLAs. A Type 1 hypervisor runs directly on hardware and is designed for virtualization, so it usually provides better efficiency and stronger resource control than Type 2. This matters because production services need stable performance and predictable response times.</w:t>
       </w:r>
     </w:p>
     <w:p>
       <w:r>
-        <w:t>Type 1 is also better for security and manageability. The hypervisor has direct control over CPU, memory, and I/O, which improves isolation between VMs. For example, if CloudCo runs web and e-commerce services in separate VMs, a fault in one VM is less likely to affect the others. Type 1 hypervisors also support snapshots, cloning, and live migration, which are useful in a datacentre.</w:t>
+        <w:t>Type 1 is also stronger for security and manageability. The hypervisor controls CPU, memory, and I/O directly, which improves VM isolation. For example, if CloudCo runs web and e-commerce services in separate VMs, a fault in one VM is less likely to affect the other. Type 1 hypervisors also support snapshots, cloning, and live migration, which are useful in a datacentre.</w:t>
       </w:r>
     </w:p>
     <w:p>

</xml_diff>

<commit_message>
Humanize Cloud Computing Assignment 1 while keeping academic tone
</commit_message>
<xml_diff>
--- a/School/CloudComputing/Assignment1_Final_Draft.docx
+++ b/School/CloudComputing/Assignment1_Final_Draft.docx
@@ -38,27 +38,27 @@
     </w:p>
     <w:p>
       <w:r>
-        <w:t>CloudCo should use a Type 1 hypervisor for the production cluster and a Type 2 hypervisor for the dev/test lab.</w:t>
+        <w:t>CloudCo should use a Type 1 hypervisor in the production cluster and a Type 2 hypervisor in the dev/test lab.</w:t>
       </w:r>
     </w:p>
     <w:p>
       <w:r>
-        <w:t>For the production cluster, Type 1 is the better choice because these workloads are customer-facing and operate under strict SLAs. A Type 1 hypervisor runs directly on hardware and is designed for virtualization, so it usually provides better efficiency and stronger resource control than Type 2. This matters because production services need stable performance and predictable response times.</w:t>
+        <w:t>For production, Type 1 is the better fit because these workloads are customer-facing and run under strict SLAs. Since a Type 1 hypervisor runs directly on the hardware, it usually gives better overall performance and stronger resource control than Type 2. That matters when the business depends on stable service and predictable response times.</w:t>
       </w:r>
     </w:p>
     <w:p>
       <w:r>
-        <w:t>Type 1 is also stronger for security and manageability. The hypervisor controls CPU, memory, and I/O directly, which improves VM isolation. For example, if CloudCo runs web and e-commerce services in separate VMs, a fault in one VM is less likely to affect the other. Type 1 hypervisors also support snapshots, cloning, and live migration, which are useful in a datacentre.</w:t>
+        <w:t>It also makes more sense from a security and management point of view. The hypervisor controls CPU, memory, and I/O directly, so VM isolation is stronger. For example, if CloudCo places web and e-commerce services in separate VMs, a failure in one VM is less likely to affect the other. Type 1 platforms also support snapshots, cloning, and live migration, which are useful in a datacentre environment.</w:t>
       </w:r>
     </w:p>
     <w:p>
       <w:r>
-        <w:t>For the dev/test lab, Type 2 is more suitable because engineers frequently create and remove VMs. A Type 2 hypervisor runs on top of a standard operating system, making it easier to install and use on developer machines. Although it has lower performance, that trade-off is acceptable in a temporary test environment. For example, an engineer can quickly test different guest operating systems using VirtualBox or VMware Workstation.</w:t>
+        <w:t>For the dev/test lab, Type 2 is more suitable because engineers need to create and remove VMs often. It runs on top of a normal operating system, so it is easier to install and use on developer machines. Even though it has more overhead, that trade-off is acceptable in a test environment. For example, an engineer can quickly try different guest operating systems using VirtualBox or VMware Workstation.</w:t>
       </w:r>
     </w:p>
     <w:p>
       <w:r>
-        <w:t>Therefore, Type 1 should be used for production because it offers stronger performance, security, and manageability, while Type 2 is better for dev/test because it is simpler and more flexible for experimentation.</w:t>
+        <w:t>Overall, Type 1 is the right choice for production because it gives stronger performance, security, and manageability, while Type 2 is better for dev/test because it is simpler and more flexible.</w:t>
       </w:r>
     </w:p>
     <w:p>
@@ -77,17 +77,17 @@
     </w:p>
     <w:p>
       <w:r>
-        <w:t>It is unsafe for a guest OS to run in real kernel mode because kernel mode allows direct access to privileged instructions, hardware devices, memory management, and I/O operations. If a guest OS had true kernel privileges, a buggy or malicious VM could interfere with the entire host. For example, it could attempt direct disk-controller access or alter memory mappings in a way that breaks isolation between VMs.</w:t>
+        <w:t>It is unsafe for a guest OS to run in real kernel mode because kernel mode gives direct access to privileged instructions, hardware devices, memory management, and I/O operations. If a guest OS had that level of control, a buggy or malicious VM could affect the entire host. For example, it could try to access a disk controller directly or change memory mappings in a way that breaks isolation between VMs.</w:t>
       </w:r>
     </w:p>
     <w:p>
       <w:r>
-        <w:t>Trap-and-emulate solves this by keeping the hypervisor in real kernel mode while the guest OS runs in a virtual kernel mode that is actually user mode from the hardware’s perspective. When the guest executes a privileged instruction, the CPU traps to the hypervisor. The hypervisor checks the request, safely performs an equivalent action, and returns control to the guest. This preserves safety while allowing the guest OS to behave as if it controls the machine.</w:t>
+        <w:t>Trap-and-emulate fixes this by keeping the hypervisor in real kernel mode while the guest OS runs in a virtual kernel mode that is actually user mode from the hardware’s perspective. When the guest executes a privileged instruction, the CPU traps to the hypervisor. The hypervisor checks the request, carries out a safe equivalent action, and then returns control to the guest. So the guest OS behaves as if it owns the machine, but the hypervisor still keeps full control.</w:t>
       </w:r>
     </w:p>
     <w:p>
       <w:r>
-        <w:t>The cost is performance overhead. Every trap causes extra work: a mode switch, hypervisor intervention, checking, and emulation. This consumes CPU time and increases latency. The impact is higher for network-intensive workloads because they perform frequent device-related operations. For example, a busy customer-facing web VM may repeatedly trap on virtual network-device access, adding delay to packet processing and reducing throughput.</w:t>
+        <w:t>The downside is overhead. Each trap creates extra work: a mode switch, hypervisor intervention, checking, and emulation. That adds CPU cost and increases latency. This is especially noticeable for network-intensive workloads, because they perform many device-related operations. For example, a busy web VM may repeatedly trap on virtual network-device access, which slows packet processing and reduces throughput.</w:t>
       </w:r>
     </w:p>
     <w:p>
@@ -106,17 +106,17 @@
     </w:p>
     <w:p>
       <w:r>
-        <w:t>In a virtualized system, memory translation is harder because there are three address spaces: guest virtual, guest physical, and host physical. Inside the VM, the guest OS still maintains its own page tables to translate guest virtual addresses to guest physical addresses. However, guest physical memory is not real machine memory. The hypervisor must also maintain mappings from guest physical addresses to host physical addresses while ensuring that different VMs do not conflict.</w:t>
+        <w:t>In a virtualized system, memory translation is harder because there are three address spaces: guest virtual, guest physical, and host physical. Inside the VM, the guest OS still maintains its own page tables and translates guest virtual addresses to guest physical addresses. However, guest physical memory is not real machine memory. The hypervisor must also maintain mappings from guest physical addresses to host physical addresses while making sure different VMs do not overlap.</w:t>
       </w:r>
     </w:p>
     <w:p>
       <w:r>
-        <w:t>This creates a two-level translation problem. Without hardware support, the hypervisor must work hard to maintain and update mappings whenever the guest changes its page tables. Nested Page Tables (NPTs) reduce this cost by allowing the CPU to accelerate the second level of translation. Each guest still keeps its own page tables, but the hypervisor maintains per-VM NPTs that map guest physical addresses to host physical addresses. This reduces frequent hypervisor intervention and lowers CPU overhead.</w:t>
+        <w:t>This creates a two-level translation problem. Without hardware support, the hypervisor has to do a lot of work whenever the guest changes its page tables. Nested Page Tables (NPTs) reduce this cost by letting the CPU accelerate the second level of translation. Each guest still keeps its own page tables, but the hypervisor keeps per-VM NPTs that map guest physical addresses to host physical addresses. That reduces how often the hypervisor has to step in and lowers CPU overhead.</w:t>
       </w:r>
     </w:p>
     <w:p>
       <w:r>
-        <w:t>However, some overhead still remains. TLB misses are still expensive because the CPU may need to walk both translation levels again. Page faults and frequent mapping changes can also still create extra work. For example, if CloudCo runs a memory-intensive analytics VM that constantly updates large in-memory datasets, CPU usage can remain high because translation and memory-management events still occur very frequently, even with NPT support.</w:t>
+        <w:t>Even so, some overhead remains. TLB misses are still expensive because the CPU may need to walk both translation levels again. Page faults and frequent mapping changes can also create extra work. For example, if CloudCo runs a memory-intensive analytics VM that constantly updates large in-memory datasets, CPU usage can still stay high because address translation and memory-management events happen so often, even with NPT support.</w:t>
       </w:r>
     </w:p>
     <w:p>
@@ -135,17 +135,17 @@
     </w:p>
     <w:p>
       <w:r>
-        <w:t>Paravirtualization changes the interaction between the guest OS and the hypervisor by making the guest OS aware that it is running inside a VM. In full virtualization, the guest behaves as if it owns the hardware, so privileged instructions must be handled through trap-and-emulate. In paravirtualization, the modified guest OS uses hypercalls to request privileged services directly from the hypervisor.</w:t>
+        <w:t>Paravirtualization changes the relationship between the guest OS and the hypervisor by making the guest aware that it is running inside a VM. In full virtualization, the guest behaves as if it owns the hardware, so privileged instructions must be handled through trap-and-emulate. In paravirtualization, the modified guest OS uses hypercalls to request privileged services directly from the hypervisor.</w:t>
       </w:r>
     </w:p>
     <w:p>
       <w:r>
-        <w:t>This can be faster than trap-and-emulate because the hypervisor does not need to wait for a trap, analyse it, and emulate the operation. The communication path is more direct, so overhead is lower. This is particularly useful for I/O-heavy workloads, where many device-related operations occur. For example, a Linux VM running a high-volume storage or network service may perform better with paravirtualized drivers because repeated device-access traps are avoided.</w:t>
+        <w:t>This can be faster because the hypervisor does not need to wait for a trap, inspect it, and emulate the operation. The request path is shorter, so the overhead is lower. This is especially helpful for I/O-heavy workloads where many device-related operations occur. For example, a Linux VM running a busy storage or network service may perform better with paravirtualized drivers because repeated device-access traps are avoided.</w:t>
       </w:r>
     </w:p>
     <w:p>
       <w:r>
-        <w:t>Modern hardware virtualization features have reduced this advantage. CPU support such as Intel VT-x and AMD-V makes full virtualization much more efficient than before. As a result, paravirtualization is now less necessary in many environments. It may still be preferred when the workload is highly I/O-intensive, the guest OS can be modified, and the environment is tightly controlled.</w:t>
+        <w:t>Modern hardware virtualization has reduced this advantage. Features such as Intel VT-x and AMD-V make full virtualization much more efficient than before, so the gap is smaller now. Still, paravirtualization can remain useful when the workload is highly I/O-intensive, the guest OS can be modified, and the environment is tightly controlled.</w:t>
       </w:r>
     </w:p>
     <w:p>
@@ -164,17 +164,17 @@
     </w:p>
     <w:p>
       <w:r>
-        <w:t>A live migration allows CloudCo to move a running virtual machine from one host to another with minimal service interruption. The key steps are: establish a connection between the source and target, create a new VM on the target, copy read-only pages, copy read-write pages while the original VM is still running, track and recopy dirty pages, briefly pause the VM for final transfer, resume it on the target, and terminate the old VM on the source host.</w:t>
+        <w:t>A live migration lets CloudCo move a running VM from one host to another with only a very short interruption. The main steps are: establish a connection between the source and target, create a new VM on the target, copy read-only pages, copy read-write pages while the original VM is still running, track and recopy dirty pages, briefly pause the VM for the final transfer, resume it on the target, and terminate the old VM on the source host.</w:t>
       </w:r>
     </w:p>
     <w:p>
       <w:r>
-        <w:t>Dirty pages are memory pages that were modified after they had already been copied to the target. They need special handling because the VM continues to serve requests during migration. If the target only receives an old copy of those pages, the resumed VM may start with inconsistent memory state. The hypervisor must therefore track which pages become dirty and recopy them before the final switchover.</w:t>
+        <w:t>Dirty pages are memory pages that were changed after they had already been copied to the target. They need special handling because the VM is still serving requests during migration. If the target only receives an old copy of those pages, the resumed VM may start with inconsistent memory state. The hypervisor therefore has to track which pages become dirty and copy them again before the final switchover.</w:t>
       </w:r>
     </w:p>
     <w:p>
       <w:r>
-        <w:t>Two practical risks can still extend downtime. First, the dirty-page rate may be too high. For example, an in-memory database VM may change pages faster than they can be copied. Second, the final runtime state may take longer than expected to transfer if the VM has a large active memory footprint or complex device state, increasing the stop-and-copy pause.</w:t>
+        <w:t>Two practical risks can still increase downtime. First, the dirty-page rate may stay too high. For example, an in-memory database VM may keep changing pages faster than they can be copied. Second, the final runtime state may take longer than expected to transfer if the VM has a large active memory footprint or complex device state, which increases the stop-and-copy pause.</w:t>
       </w:r>
     </w:p>
     <w:p>
@@ -193,17 +193,17 @@
     </w:p>
     <w:p>
       <w:r>
-        <w:t>For CloudCo’s analytics platform, both virtual appliances and containers are useful, but they are suitable in different scenarios.</w:t>
+        <w:t>For CloudCo’s analytics platform, both virtual appliances and containers are useful, but they fit different deployment situations.</w:t>
       </w:r>
     </w:p>
     <w:p>
       <w:r>
-        <w:t>A virtual appliance packages the complete software stack into a preconfigured VM image, including the operating system, libraries, frameworks, and application code. This is valuable when deployment is complex and customers often encounter dependency problems. In CloudCo’s case, the platform includes a web interface, SQL database, and analytics engine with many dependencies such as Python, TensorFlow, pandas, and scikit-learn. For example, a customer could import a prepared VM image and run the full platform without manually configuring each dependency.</w:t>
+        <w:t>A virtual appliance packages the full software stack into a preconfigured VM image, including the operating system, libraries, frameworks, and application code. This is useful when deployment is complex and customers often run into dependency problems. In CloudCo’s case, the platform includes a web interface, SQL database, and analytics engine with dependencies such as Python, TensorFlow, pandas, and scikit-learn. For example, a customer could import a prepared VM image and run the full platform without manually installing each dependency.</w:t>
       </w:r>
     </w:p>
     <w:p>
       <w:r>
-        <w:t>Containers are lighter and start faster because they share the host operating system kernel. They are more suitable when components can be split into smaller services and deployed independently. For example, CloudCo could package the web interface, analytics worker, and API services as separate containers for faster scaling and updates. Therefore, virtual appliances suit full, self-contained delivery, while containers suit modular, cloud-native deployment.</w:t>
+        <w:t>Containers are lighter and start faster because they share the host operating system kernel. They work better when components can be split into smaller services and deployed independently. For example, CloudCo could package the web interface, analytics worker, and API services as separate containers for faster scaling and updates. So, virtual appliances are better for full, self-contained delivery, while containers are better for modular, cloud-native deployment.</w:t>
       </w:r>
     </w:p>
     <w:p>
@@ -222,22 +222,22 @@
     </w:p>
     <w:p>
       <w:r>
-        <w:t>Virtual machines and containers differ in isolation strength, operating-system compatibility, performance overhead, scalability, and management complexity. Because CloudCo operates both legacy Windows applications and modern Linux microservices, it should not use the same approach for both.</w:t>
+        <w:t>Virtual machines and containers differ in isolation strength, operating-system compatibility, performance overhead, scalability, and management complexity. Since CloudCo runs both legacy Windows applications and modern Linux microservices, it should not use one approach for everything.</w:t>
       </w:r>
     </w:p>
     <w:p>
       <w:r>
-        <w:t>VMs provide stronger isolation because each VM has its own guest OS and virtualized hardware. This makes them suitable for CloudCo’s legacy Windows applications, which are difficult to modify and may require strict separation from other workloads. VMs also provide broader operating-system compatibility. For example, a legacy Windows application can run inside a Windows VM even if the surrounding infrastructure also supports Linux workloads.</w:t>
+        <w:t>VMs provide stronger isolation because each VM has its own guest OS and virtualized hardware. This makes them suitable for CloudCo’s legacy Windows applications, which are harder to modify and may need strict separation from other workloads. VMs also support broader operating-system compatibility. For example, a legacy Windows application can run inside a Windows VM even if the rest of the environment also supports Linux workloads.</w:t>
       </w:r>
     </w:p>
     <w:p>
       <w:r>
-        <w:t>Containers provide weaker isolation because they share the host kernel, but they have much lower overhead and scale much more easily. They start faster, consume fewer resources, and are ideal for Linux-based microservices that require rapid scaling and frequent updates. Running these microservices in full VMs would increase startup time and resource usage unnecessarily.</w:t>
+        <w:t>Containers provide weaker isolation because they share the host kernel, but they have much lower overhead and scale more easily. They start faster, use fewer resources, and are well suited to Linux microservices that need rapid scaling and frequent updates. Running those microservices in full VMs would increase startup time and resource usage without much benefit.</w:t>
       </w:r>
     </w:p>
     <w:p>
       <w:r>
-        <w:t>The appropriate strategy is therefore to deploy the legacy Windows applications in VMs and the Linux microservices in containers. Strong isolation is more important for the Windows workloads because of compatibility and stability requirements. By contrast, the microservices benefit more from fast scaling. Choosing the wrong approach would create clear disadvantages, such as compatibility issues for Windows apps in containers or poor elasticity if lightweight microservices are forced into full VMs.</w:t>
+        <w:t>The best strategy is to run the legacy Windows applications in VMs and the Linux microservices in containers. Strong isolation matters more for the Windows workloads because of compatibility and stability needs. By contrast, the microservices benefit more from speed and elasticity. If CloudCo chose the wrong approach, it could face compatibility problems for Windows apps in containers or poor scalability if lightweight microservices were forced into VMs.</w:t>
       </w:r>
     </w:p>
     <w:sectPr>

</xml_diff>